<commit_message>
Add Apple Silicon support and MLX as an optional Mac alternative to PyTorch
- env/requirements-mac-mlx.txt: MLX (+mlx-data) extras, Apple-Silicon-only.
- Checker: detect arm64 macOS, report native run + an MLX smoke test
  (compute + default device); hint './setup.sh --with-mlx' when absent.
  Verified on this M-series Mac: 'MLX 0.31.2 works (default device: Device(gpu, 0))'.
- setup.sh: detect Apple Silicon, new --with-mlx flag (in --all), auto-offer on
  Apple Silicon, skip with a clear note on Intel/Linux. shellcheck-clean.
- Docs: new 'Apple Silicon & MLX' section (setup.html), Day-4 note (syllabus),
  README quick-start + file table, MLX reference (resources). Flag that Docker
  on Mac has no Metal GPU — use the native install for MPS/MLX acceleration.
- Regenerated participant guide (PDF + Word) with the Apple Silicon/MLX section.

Co-Authored-By: Claude Fable 5 <noreply@anthropic.com>
</commit_message>
<xml_diff>
--- a/dist/Image-Analysis-for-Plant-Phenotyping-Participant-Guide.docx
+++ b/dist/Image-Analysis-for-Plant-Phenotyping-Participant-Guide.docx
@@ -55,7 +55,7 @@
         </w:rPr>
         <w:t xml:space="preserve">Live course site: </w:t>
       </w:r>
-      <w:hyperlink w:history="1" r:id="rIdjw4hktf3esfqwnqimwkvg">
+      <w:hyperlink w:history="1" r:id="rIdqmtbmvajqmrf6vnvnx5yd">
         <w:r>
           <w:rPr>
             <w:rStyle w:val="Hyperlink"/>
@@ -4987,6 +4987,77 @@
           <w:iCs/>
         </w:rPr>
         <w:t xml:space="preserve">Open-source-first: where teams already license commercial tools, the common equivalents are Pix4D / Agisoft Metashape (→ COLMAP/Meshroom + QGIS) and MATLAB + Image Processing Toolbox (→ scikit-image / OpenCV). These are noted but not used in practicals.</w:t>
+      </w:r>
+    </w:p>
+    <w:p>
+      <w:pPr>
+        <w:pStyle w:val="Heading2"/>
+      </w:pPr>
+      <w:r>
+        <w:t xml:space="preserve">Apple Silicon &amp; MLX (Mac alternative to PyTorch)</w:t>
+      </w:r>
+    </w:p>
+    <w:p>
+      <w:pPr>
+        <w:spacing w:after="120"/>
+      </w:pPr>
+      <w:r>
+        <w:t xml:space="preserve">On Apple Silicon (M-series) Macs the whole stack installs and runs natively as arm64, and PyTorch automatically uses the Metal (MPS) GPU — the Day-4 practical works out of the box.</w:t>
+      </w:r>
+    </w:p>
+    <w:p>
+      <w:pPr>
+        <w:spacing w:after="120"/>
+      </w:pPr>
+      <w:r>
+        <w:t xml:space="preserve">Optionally, add MLX, Apple's array/ML framework. On Apple Silicon it runs on the GPU via Metal with unified memory and is often faster than PyTorch-MPS for training small CNNs from scratch — a good alternative for the Day-4 classification task. YOLO and SAM stay on PyTorch (which uses MPS), so MLX is an alternative for the CNN-training portion, not a whole-stack replacement. Install it with:</w:t>
+      </w:r>
+    </w:p>
+    <w:p>
+      <w:pPr>
+        <w:shd w:fill="F1F5F2" w:val="clear"/>
+        <w:spacing w:after="0"/>
+        <w:ind w:left="120"/>
+      </w:pPr>
+      <w:r>
+        <w:rPr>
+          <w:rFonts w:ascii="Consolas" w:cs="Consolas" w:eastAsia="Consolas" w:hAnsi="Consolas"/>
+          <w:sz w:val="20"/>
+          <w:szCs w:val="20"/>
+        </w:rPr>
+        <w:t xml:space="preserve">./setup.sh --with-mlx   (offered automatically on Apple Silicon)</w:t>
+      </w:r>
+    </w:p>
+    <w:p>
+      <w:pPr>
+        <w:shd w:fill="F1F5F2" w:val="clear"/>
+        <w:spacing w:after="0"/>
+        <w:ind w:left="120"/>
+      </w:pPr>
+      <w:r>
+        <w:rPr>
+          <w:rFonts w:ascii="Consolas" w:cs="Consolas" w:eastAsia="Consolas" w:hAnsi="Consolas"/>
+          <w:sz w:val="20"/>
+          <w:szCs w:val="20"/>
+        </w:rPr>
+        <w:t xml:space="preserve">pip install -r env/requirements-mac-mlx.txt   (into your activated env)</w:t>
+      </w:r>
+    </w:p>
+    <w:p>
+      <w:pPr>
+        <w:spacing w:after="120"/>
+      </w:pPr>
+    </w:p>
+    <w:p>
+      <w:pPr>
+        <w:spacing w:after="120"/>
+      </w:pPr>
+      <w:r>
+        <w:rPr>
+          <w:i/>
+          <w:iCs/>
+        </w:rPr>
+        <w:t xml:space="preserve">Apple Silicon only — there are no MLX wheels for Intel Macs, and MLX has no Metal GPU inside Docker on a Mac, so use the native install. The verifier confirms it with a line like “[ ok ] MLX works (default device: Device(gpu, 0))”.</w:t>
       </w:r>
     </w:p>
     <w:p>

</xml_diff>